<commit_message>
Geschichte 11: Bild-Impuls mit Fehlersuche als Einstieg ins Bürgeramt
Co-Authored-By: Claude Opus 5.5 <noreply@anthropic.com>
Claude-Session: https://claude.ai/code/session_013iN4Tiarea1J9YUJHZ9iqC
</commit_message>
<xml_diff>
--- a/Geschichte_11/Stunde_Buergeramt_Athen/Handreichung_Buergeramt_Athen.docx
+++ b/Geschichte_11/Stunde_Buergeramt_Athen/Handreichung_Buergeramt_Athen.docx
@@ -582,7 +582,7 @@
           <w:sz w:val="20"/>
           <w:szCs w:val="20"/>
         </w:rPr>
-        <w:t xml:space="preserve">☐  Tafel: Tabelle mit den Spalten Nr. · Anliegen · ✔ · ✘ · weil … vorbereiten – oder Folie 4 aufs Whiteboard projizieren und direkt hineinschreiben lassen.</w:t>
+        <w:t xml:space="preserve">☐  Tafel: Tabelle mit den Spalten Nr. · Anliegen · ✔ · ✘ · weil … vorbereiten – oder Folie 6 aufs Whiteboard projizieren und direkt hineinschreiben lassen.</w:t>
       </w:r>
     </w:p>
     <w:p>
@@ -833,7 +833,7 @@
                 <w:sz w:val="18"/>
                 <w:szCs w:val="18"/>
               </w:rPr>
-              <w:t xml:space="preserve">0–2</w:t>
+              <w:t xml:space="preserve">0–3</w:t>
             </w:r>
           </w:p>
         </w:tc>
@@ -862,7 +862,7 @@
                 <w:sz w:val="18"/>
                 <w:szCs w:val="18"/>
               </w:rPr>
-              <w:t xml:space="preserve">Einstieg</w:t>
+              <w:t xml:space="preserve">Bild-Impuls</w:t>
             </w:r>
           </w:p>
         </w:tc>
@@ -891,7 +891,7 @@
                 <w:sz w:val="18"/>
                 <w:szCs w:val="18"/>
               </w:rPr>
-              <w:t xml:space="preserve">Situation: Ihr seid die Beamten im Bürgeramt. Pro Tisch ein Anliegen austeilen.</w:t>
+              <w:t xml:space="preserve">Cartoon der Sachbearbeiterin: „Was stimmt an diesem Bild nicht?“ Zu zweit drei Fehler suchen (Frau im Amt, Brille, Kaffee). Auflösung: Ein Bild ist eine Darstellung, keine Quelle – der Satz in der Sprechblase stimmt aber.</w:t>
             </w:r>
           </w:p>
         </w:tc>
@@ -920,7 +920,7 @@
                 <w:sz w:val="18"/>
                 <w:szCs w:val="18"/>
               </w:rPr>
-              <w:t xml:space="preserve">Plenum</w:t>
+              <w:t xml:space="preserve">PA, Plenum</w:t>
             </w:r>
           </w:p>
         </w:tc>
@@ -949,7 +949,7 @@
                 <w:sz w:val="18"/>
                 <w:szCs w:val="18"/>
               </w:rPr>
-              <w:t xml:space="preserve">1–2</w:t>
+              <w:t xml:space="preserve">2–3</w:t>
             </w:r>
           </w:p>
         </w:tc>
@@ -984,7 +984,7 @@
                 <w:sz w:val="18"/>
                 <w:szCs w:val="18"/>
               </w:rPr>
-              <w:t xml:space="preserve">2–12</w:t>
+              <w:t xml:space="preserve">3–5</w:t>
             </w:r>
           </w:p>
         </w:tc>
@@ -1013,7 +1013,7 @@
                 <w:sz w:val="18"/>
                 <w:szCs w:val="18"/>
               </w:rPr>
-              <w:t xml:space="preserve">Am Tisch</w:t>
+              <w:t xml:space="preserve">Einstieg</w:t>
             </w:r>
           </w:p>
         </w:tc>
@@ -1042,7 +1042,7 @@
                 <w:sz w:val="18"/>
                 <w:szCs w:val="18"/>
               </w:rPr>
-              <w:t xml:space="preserve">Anliegen prüfen, genehmigt oder abgelehnt, jeder schreibt die Begründung ins Heft. Einen „Beamten“ für die Tafel bestimmen.</w:t>
+              <w:t xml:space="preserve">Situation: Ihr seid die Beamten im Bürgeramt. Pro Tisch ein Anliegen austeilen.</w:t>
             </w:r>
           </w:p>
         </w:tc>
@@ -1071,7 +1071,7 @@
                 <w:sz w:val="18"/>
                 <w:szCs w:val="18"/>
               </w:rPr>
-              <w:t xml:space="preserve">GA, EA</w:t>
+              <w:t xml:space="preserve">Plenum</w:t>
             </w:r>
           </w:p>
         </w:tc>
@@ -1100,7 +1100,7 @@
                 <w:sz w:val="18"/>
                 <w:szCs w:val="18"/>
               </w:rPr>
-              <w:t xml:space="preserve">3</w:t>
+              <w:t xml:space="preserve">6</w:t>
             </w:r>
           </w:p>
         </w:tc>
@@ -1135,7 +1135,7 @@
                 <w:sz w:val="18"/>
                 <w:szCs w:val="18"/>
               </w:rPr>
-              <w:t xml:space="preserve">12–27</w:t>
+              <w:t xml:space="preserve">5–14</w:t>
             </w:r>
           </w:p>
         </w:tc>
@@ -1164,7 +1164,7 @@
                 <w:sz w:val="18"/>
                 <w:szCs w:val="18"/>
               </w:rPr>
-              <w:t xml:space="preserve">Tafel</w:t>
+              <w:t xml:space="preserve">Am Tisch</w:t>
             </w:r>
           </w:p>
         </w:tc>
@@ -1193,7 +1193,7 @@
                 <w:sz w:val="18"/>
                 <w:szCs w:val="18"/>
               </w:rPr>
-              <w:t xml:space="preserve">Die Beamten tragen nacheinander ihre Entscheidung ein und begründen in einem Satz. Alle füllen ihre Ergebnistabelle aus.</w:t>
+              <w:t xml:space="preserve">Anliegen prüfen, genehmigt oder abgelehnt, jeder schreibt die Begründung ins Heft. Einen „Beamten“ für die Tafel bestimmen.</w:t>
             </w:r>
           </w:p>
         </w:tc>
@@ -1222,7 +1222,7 @@
                 <w:sz w:val="18"/>
                 <w:szCs w:val="18"/>
               </w:rPr>
-              <w:t xml:space="preserve">Plenum</w:t>
+              <w:t xml:space="preserve">GA, EA</w:t>
             </w:r>
           </w:p>
         </w:tc>
@@ -1251,7 +1251,7 @@
                 <w:sz w:val="18"/>
                 <w:szCs w:val="18"/>
               </w:rPr>
-              <w:t xml:space="preserve">4</w:t>
+              <w:t xml:space="preserve">5</w:t>
             </w:r>
           </w:p>
         </w:tc>
@@ -1286,7 +1286,7 @@
                 <w:sz w:val="18"/>
                 <w:szCs w:val="18"/>
               </w:rPr>
-              <w:t xml:space="preserve">27–29</w:t>
+              <w:t xml:space="preserve">14–28</w:t>
             </w:r>
           </w:p>
         </w:tc>
@@ -1315,7 +1315,7 @@
                 <w:sz w:val="18"/>
                 <w:szCs w:val="18"/>
               </w:rPr>
-              <w:t xml:space="preserve">Lösung</w:t>
+              <w:t xml:space="preserve">Tafel</w:t>
             </w:r>
           </w:p>
         </w:tc>
@@ -1344,7 +1344,7 @@
                 <w:sz w:val="18"/>
                 <w:szCs w:val="18"/>
               </w:rPr>
-              <w:t xml:space="preserve">Selbstkontrolle. Kurzer Impuls: Anliegen 4 und 7 vergleichen – Geld statt Blut.</w:t>
+              <w:t xml:space="preserve">Die Beamten tragen nacheinander ihre Entscheidung ein und begründen in einem Satz. Alle füllen ihre Ergebnistabelle aus.</w:t>
             </w:r>
           </w:p>
         </w:tc>
@@ -1402,7 +1402,7 @@
                 <w:sz w:val="18"/>
                 <w:szCs w:val="18"/>
               </w:rPr>
-              <w:t xml:space="preserve">5</w:t>
+              <w:t xml:space="preserve">6</w:t>
             </w:r>
           </w:p>
         </w:tc>
@@ -1437,7 +1437,7 @@
                 <w:sz w:val="18"/>
                 <w:szCs w:val="18"/>
               </w:rPr>
-              <w:t xml:space="preserve">29–36</w:t>
+              <w:t xml:space="preserve">28–30</w:t>
             </w:r>
           </w:p>
         </w:tc>
@@ -1466,7 +1466,7 @@
                 <w:sz w:val="18"/>
                 <w:szCs w:val="18"/>
               </w:rPr>
-              <w:t xml:space="preserve">Sicherung</w:t>
+              <w:t xml:space="preserve">Lösung</w:t>
             </w:r>
           </w:p>
         </w:tc>
@@ -1495,7 +1495,7 @@
                 <w:sz w:val="18"/>
                 <w:szCs w:val="18"/>
               </w:rPr>
-              <w:t xml:space="preserve">Buch und Hefter zu. Stummes Schaubild ausfüllen.</w:t>
+              <w:t xml:space="preserve">Selbstkontrolle. Kurzer Impuls: Anliegen 4 und 7 vergleichen – Geld statt Blut.</w:t>
             </w:r>
           </w:p>
         </w:tc>
@@ -1524,7 +1524,7 @@
                 <w:sz w:val="18"/>
                 <w:szCs w:val="18"/>
               </w:rPr>
-              <w:t xml:space="preserve">EA</w:t>
+              <w:t xml:space="preserve">Plenum</w:t>
             </w:r>
           </w:p>
         </w:tc>
@@ -1553,7 +1553,7 @@
                 <w:sz w:val="18"/>
                 <w:szCs w:val="18"/>
               </w:rPr>
-              <w:t xml:space="preserve">6</w:t>
+              <w:t xml:space="preserve">7</w:t>
             </w:r>
           </w:p>
         </w:tc>
@@ -1588,7 +1588,7 @@
                 <w:sz w:val="18"/>
                 <w:szCs w:val="18"/>
               </w:rPr>
-              <w:t xml:space="preserve">36–39</w:t>
+              <w:t xml:space="preserve">30–37</w:t>
             </w:r>
           </w:p>
         </w:tc>
@@ -1617,7 +1617,7 @@
                 <w:sz w:val="18"/>
                 <w:szCs w:val="18"/>
               </w:rPr>
-              <w:t xml:space="preserve">Selbstkontrolle</w:t>
+              <w:t xml:space="preserve">Sicherung</w:t>
             </w:r>
           </w:p>
         </w:tc>
@@ -1646,7 +1646,7 @@
                 <w:sz w:val="18"/>
                 <w:szCs w:val="18"/>
               </w:rPr>
-              <w:t xml:space="preserve">Lösung zeigen, Fehler farbig markieren. Blatt in den Hefter.</w:t>
+              <w:t xml:space="preserve">Buch und Hefter zu. Stummes Schaubild ausfüllen.</w:t>
             </w:r>
           </w:p>
         </w:tc>
@@ -1704,7 +1704,7 @@
                 <w:sz w:val="18"/>
                 <w:szCs w:val="18"/>
               </w:rPr>
-              <w:t xml:space="preserve">7</w:t>
+              <w:t xml:space="preserve">8</w:t>
             </w:r>
           </w:p>
         </w:tc>
@@ -1739,7 +1739,158 @@
                 <w:sz w:val="18"/>
                 <w:szCs w:val="18"/>
               </w:rPr>
-              <w:t xml:space="preserve">39–45</w:t>
+              <w:t xml:space="preserve">37–40</w:t>
+            </w:r>
+          </w:p>
+        </w:tc>
+        <w:tc>
+          <w:tcPr>
+            <w:tcW w:type="dxa" w:w="1650"/>
+            <w:tcBorders>
+              <w:top w:val="single" w:color="BFB5A5" w:sz="4"/>
+              <w:left w:val="single" w:color="BFB5A5" w:sz="4"/>
+              <w:bottom w:val="single" w:color="BFB5A5" w:sz="4"/>
+              <w:right w:val="single" w:color="BFB5A5" w:sz="4"/>
+            </w:tcBorders>
+            <w:tcMar>
+              <w:top w:type="dxa" w:w="70"/>
+              <w:left w:type="dxa" w:w="100"/>
+              <w:bottom w:type="dxa" w:w="70"/>
+              <w:right w:type="dxa" w:w="100"/>
+            </w:tcMar>
+          </w:tcPr>
+          <w:p>
+            <w:pPr>
+              <w:spacing w:after="0" w:before="0"/>
+            </w:pPr>
+            <w:r>
+              <w:rPr>
+                <w:sz w:val="18"/>
+                <w:szCs w:val="18"/>
+              </w:rPr>
+              <w:t xml:space="preserve">Selbstkontrolle</w:t>
+            </w:r>
+          </w:p>
+        </w:tc>
+        <w:tc>
+          <w:tcPr>
+            <w:tcW w:type="dxa" w:w="4188"/>
+            <w:tcBorders>
+              <w:top w:val="single" w:color="BFB5A5" w:sz="4"/>
+              <w:left w:val="single" w:color="BFB5A5" w:sz="4"/>
+              <w:bottom w:val="single" w:color="BFB5A5" w:sz="4"/>
+              <w:right w:val="single" w:color="BFB5A5" w:sz="4"/>
+            </w:tcBorders>
+            <w:tcMar>
+              <w:top w:type="dxa" w:w="70"/>
+              <w:left w:type="dxa" w:w="100"/>
+              <w:bottom w:type="dxa" w:w="70"/>
+              <w:right w:type="dxa" w:w="100"/>
+            </w:tcMar>
+          </w:tcPr>
+          <w:p>
+            <w:pPr>
+              <w:spacing w:after="0" w:before="0"/>
+            </w:pPr>
+            <w:r>
+              <w:rPr>
+                <w:sz w:val="18"/>
+                <w:szCs w:val="18"/>
+              </w:rPr>
+              <w:t xml:space="preserve">Lösung zeigen, Fehler farbig markieren. Blatt in den Hefter.</w:t>
+            </w:r>
+          </w:p>
+        </w:tc>
+        <w:tc>
+          <w:tcPr>
+            <w:tcW w:type="dxa" w:w="1450"/>
+            <w:tcBorders>
+              <w:top w:val="single" w:color="BFB5A5" w:sz="4"/>
+              <w:left w:val="single" w:color="BFB5A5" w:sz="4"/>
+              <w:bottom w:val="single" w:color="BFB5A5" w:sz="4"/>
+              <w:right w:val="single" w:color="BFB5A5" w:sz="4"/>
+            </w:tcBorders>
+            <w:tcMar>
+              <w:top w:type="dxa" w:w="70"/>
+              <w:left w:type="dxa" w:w="100"/>
+              <w:bottom w:type="dxa" w:w="70"/>
+              <w:right w:type="dxa" w:w="100"/>
+            </w:tcMar>
+          </w:tcPr>
+          <w:p>
+            <w:pPr>
+              <w:spacing w:after="0" w:before="0"/>
+            </w:pPr>
+            <w:r>
+              <w:rPr>
+                <w:sz w:val="18"/>
+                <w:szCs w:val="18"/>
+              </w:rPr>
+              <w:t xml:space="preserve">EA</w:t>
+            </w:r>
+          </w:p>
+        </w:tc>
+        <w:tc>
+          <w:tcPr>
+            <w:tcW w:type="dxa" w:w="1500"/>
+            <w:tcBorders>
+              <w:top w:val="single" w:color="BFB5A5" w:sz="4"/>
+              <w:left w:val="single" w:color="BFB5A5" w:sz="4"/>
+              <w:bottom w:val="single" w:color="BFB5A5" w:sz="4"/>
+              <w:right w:val="single" w:color="BFB5A5" w:sz="4"/>
+            </w:tcBorders>
+            <w:tcMar>
+              <w:top w:type="dxa" w:w="70"/>
+              <w:left w:type="dxa" w:w="100"/>
+              <w:bottom w:type="dxa" w:w="70"/>
+              <w:right w:type="dxa" w:w="100"/>
+            </w:tcMar>
+          </w:tcPr>
+          <w:p>
+            <w:pPr>
+              <w:spacing w:after="0" w:before="0"/>
+            </w:pPr>
+            <w:r>
+              <w:rPr>
+                <w:sz w:val="18"/>
+                <w:szCs w:val="18"/>
+              </w:rPr>
+              <w:t xml:space="preserve">9</w:t>
+            </w:r>
+          </w:p>
+        </w:tc>
+      </w:tr>
+      <w:tr>
+        <w:trPr>
+          <w:cantSplit/>
+        </w:trPr>
+        <w:tc>
+          <w:tcPr>
+            <w:tcW w:type="dxa" w:w="850"/>
+            <w:tcBorders>
+              <w:top w:val="single" w:color="BFB5A5" w:sz="4"/>
+              <w:left w:val="single" w:color="BFB5A5" w:sz="4"/>
+              <w:bottom w:val="single" w:color="BFB5A5" w:sz="4"/>
+              <w:right w:val="single" w:color="BFB5A5" w:sz="4"/>
+            </w:tcBorders>
+            <w:shd w:fill="F4ECDE" w:color="auto" w:val="clear"/>
+            <w:tcMar>
+              <w:top w:type="dxa" w:w="70"/>
+              <w:left w:type="dxa" w:w="100"/>
+              <w:bottom w:type="dxa" w:w="70"/>
+              <w:right w:type="dxa" w:w="100"/>
+            </w:tcMar>
+          </w:tcPr>
+          <w:p>
+            <w:pPr>
+              <w:spacing w:after="0" w:before="0"/>
+            </w:pPr>
+            <w:r>
+              <w:rPr>
+                <w:sz w:val="18"/>
+                <w:szCs w:val="18"/>
+              </w:rPr>
+              <w:t xml:space="preserve">40–45</w:t>
             </w:r>
           </w:p>
         </w:tc>

</xml_diff>

<commit_message>
Geschichte 11: Bürgeramt als Doppelstunde (70 Min.) mit Sach- und Werturteil, Urteilsblatt
Co-Authored-By: Claude Opus 5.5 <noreply@anthropic.com>
Claude-Session: https://claude.ai/code/session_013iN4Tiarea1J9YUJHZ9iqC
</commit_message>
<xml_diff>
--- a/Geschichte_11/Stunde_Buergeramt_Athen/Handreichung_Buergeramt_Athen.docx
+++ b/Geschichte_11/Stunde_Buergeramt_Athen/Handreichung_Buergeramt_Athen.docx
@@ -14,7 +14,7 @@
           <w:sz w:val="16"/>
           <w:szCs w:val="16"/>
         </w:rPr>
-        <w:t xml:space="preserve">HANDREICHUNG · GESCHICHTE KLASSE 11 · EINZELSTUNDE (45 MIN.)</w:t>
+        <w:t xml:space="preserve">HANDREICHUNG · GESCHICHTE KLASSE 11 · DOPPELSTUNDE (70 MIN., DANACH KLAUSURVORBEREITUNG)</w:t>
       </w:r>
     </w:p>
     <w:p>
@@ -30,7 +30,7 @@
           <w:sz w:val="34"/>
           <w:szCs w:val="34"/>
         </w:rPr>
-        <w:t xml:space="preserve">Bürgeramt Athen: Solons Verfassung durchspielen</w:t>
+        <w:t xml:space="preserve">Bürgeramt Athen: Solons Verfassung durchspielen und beurteilen</w:t>
       </w:r>
     </w:p>
     <w:p>
@@ -527,6 +527,112 @@
                 <w:szCs w:val="18"/>
               </w:rPr>
               <w:t xml:space="preserve">A4 quer, 2 Exemplare pro Blatt, in der Mitte schneiden.</w:t>
+            </w:r>
+          </w:p>
+        </w:tc>
+      </w:tr>
+      <w:tr>
+        <w:trPr>
+          <w:cantSplit/>
+        </w:trPr>
+        <w:tc>
+          <w:tcPr>
+            <w:tcW w:type="dxa" w:w="3200"/>
+            <w:tcBorders>
+              <w:top w:val="single" w:color="BFB5A5" w:sz="4"/>
+              <w:left w:val="single" w:color="BFB5A5" w:sz="4"/>
+              <w:bottom w:val="single" w:color="BFB5A5" w:sz="4"/>
+              <w:right w:val="single" w:color="BFB5A5" w:sz="4"/>
+            </w:tcBorders>
+            <w:tcMar>
+              <w:top w:type="dxa" w:w="70"/>
+              <w:left w:type="dxa" w:w="100"/>
+              <w:bottom w:type="dxa" w:w="70"/>
+              <w:right w:type="dxa" w:w="100"/>
+            </w:tcMar>
+          </w:tcPr>
+          <w:p>
+            <w:pPr>
+              <w:spacing w:after="30" w:before="0"/>
+            </w:pPr>
+            <w:r>
+              <w:rPr>
+                <w:b/>
+                <w:bCs/>
+                <w:sz w:val="18"/>
+                <w:szCs w:val="18"/>
+              </w:rPr>
+              <w:t xml:space="preserve">Urteilsblatt</w:t>
+            </w:r>
+          </w:p>
+          <w:p>
+            <w:pPr>
+              <w:spacing w:after="30" w:before="0"/>
+            </w:pPr>
+            <w:r>
+              <w:rPr>
+                <w:sz w:val="18"/>
+                <w:szCs w:val="18"/>
+              </w:rPr>
+              <w:t xml:space="preserve">Urteilsblatt_A5.docx</w:t>
+            </w:r>
+          </w:p>
+        </w:tc>
+        <w:tc>
+          <w:tcPr>
+            <w:tcW w:type="dxa" w:w="2300"/>
+            <w:tcBorders>
+              <w:top w:val="single" w:color="BFB5A5" w:sz="4"/>
+              <w:left w:val="single" w:color="BFB5A5" w:sz="4"/>
+              <w:bottom w:val="single" w:color="BFB5A5" w:sz="4"/>
+              <w:right w:val="single" w:color="BFB5A5" w:sz="4"/>
+            </w:tcBorders>
+            <w:tcMar>
+              <w:top w:type="dxa" w:w="70"/>
+              <w:left w:type="dxa" w:w="100"/>
+              <w:bottom w:type="dxa" w:w="70"/>
+              <w:right w:type="dxa" w:w="100"/>
+            </w:tcMar>
+          </w:tcPr>
+          <w:p>
+            <w:pPr>
+              <w:spacing w:after="0" w:before="0"/>
+            </w:pPr>
+            <w:r>
+              <w:rPr>
+                <w:sz w:val="18"/>
+                <w:szCs w:val="18"/>
+              </w:rPr>
+              <w:t xml:space="preserve">halb so viele Blätter wie Schüler</w:t>
+            </w:r>
+          </w:p>
+        </w:tc>
+        <w:tc>
+          <w:tcPr>
+            <w:tcW w:type="dxa" w:w="4138"/>
+            <w:tcBorders>
+              <w:top w:val="single" w:color="BFB5A5" w:sz="4"/>
+              <w:left w:val="single" w:color="BFB5A5" w:sz="4"/>
+              <w:bottom w:val="single" w:color="BFB5A5" w:sz="4"/>
+              <w:right w:val="single" w:color="BFB5A5" w:sz="4"/>
+            </w:tcBorders>
+            <w:tcMar>
+              <w:top w:type="dxa" w:w="70"/>
+              <w:left w:type="dxa" w:w="100"/>
+              <w:bottom w:type="dxa" w:w="70"/>
+              <w:right w:type="dxa" w:w="100"/>
+            </w:tcMar>
+          </w:tcPr>
+          <w:p>
+            <w:pPr>
+              <w:spacing w:after="0" w:before="0"/>
+            </w:pPr>
+            <w:r>
+              <w:rPr>
+                <w:sz w:val="18"/>
+                <w:szCs w:val="18"/>
+              </w:rPr>
+              <w:t xml:space="preserve">A4 quer, 2 Exemplare pro Blatt. Wird am Ende eingesammelt (Diagnose).</w:t>
             </w:r>
           </w:p>
         </w:tc>
@@ -1890,7 +1996,7 @@
                 <w:sz w:val="18"/>
                 <w:szCs w:val="18"/>
               </w:rPr>
-              <w:t xml:space="preserve">40–45</w:t>
+              <w:t xml:space="preserve">40–46</w:t>
             </w:r>
           </w:p>
         </w:tc>
@@ -1919,7 +2025,7 @@
                 <w:sz w:val="18"/>
                 <w:szCs w:val="18"/>
               </w:rPr>
-              <w:t xml:space="preserve">Puffer</w:t>
+              <w:t xml:space="preserve">Demokratie?</w:t>
             </w:r>
           </w:p>
         </w:tc>
@@ -1948,7 +2054,7 @@
                 <w:sz w:val="18"/>
                 <w:szCs w:val="18"/>
               </w:rPr>
-              <w:t xml:space="preserve">Falls Zeit bleibt: Sachurteil „War Solons Verfassung eher demokratisch oder timokratisch?“ beginnen, sonst Hausaufgabe.</w:t>
+              <w:t xml:space="preserve">Daumenabfrage (Erwartung: Nein). Paare ordnen sechs Merkmale „demokratisch“ / „timokratisch“ zu. Auflösung: beides.</w:t>
             </w:r>
           </w:p>
         </w:tc>
@@ -1977,6 +2083,157 @@
                 <w:sz w:val="18"/>
                 <w:szCs w:val="18"/>
               </w:rPr>
+              <w:t xml:space="preserve">Plenum, PA</w:t>
+            </w:r>
+          </w:p>
+        </w:tc>
+        <w:tc>
+          <w:tcPr>
+            <w:tcW w:type="dxa" w:w="1500"/>
+            <w:tcBorders>
+              <w:top w:val="single" w:color="BFB5A5" w:sz="4"/>
+              <w:left w:val="single" w:color="BFB5A5" w:sz="4"/>
+              <w:bottom w:val="single" w:color="BFB5A5" w:sz="4"/>
+              <w:right w:val="single" w:color="BFB5A5" w:sz="4"/>
+            </w:tcBorders>
+            <w:tcMar>
+              <w:top w:type="dxa" w:w="70"/>
+              <w:left w:type="dxa" w:w="100"/>
+              <w:bottom w:type="dxa" w:w="70"/>
+              <w:right w:type="dxa" w:w="100"/>
+            </w:tcMar>
+          </w:tcPr>
+          <w:p>
+            <w:pPr>
+              <w:spacing w:after="0" w:before="0"/>
+            </w:pPr>
+            <w:r>
+              <w:rPr>
+                <w:sz w:val="18"/>
+                <w:szCs w:val="18"/>
+              </w:rPr>
+              <w:t xml:space="preserve">10–12</w:t>
+            </w:r>
+          </w:p>
+        </w:tc>
+      </w:tr>
+      <w:tr>
+        <w:trPr>
+          <w:cantSplit/>
+        </w:trPr>
+        <w:tc>
+          <w:tcPr>
+            <w:tcW w:type="dxa" w:w="850"/>
+            <w:tcBorders>
+              <w:top w:val="single" w:color="BFB5A5" w:sz="4"/>
+              <w:left w:val="single" w:color="BFB5A5" w:sz="4"/>
+              <w:bottom w:val="single" w:color="BFB5A5" w:sz="4"/>
+              <w:right w:val="single" w:color="BFB5A5" w:sz="4"/>
+            </w:tcBorders>
+            <w:shd w:fill="F4ECDE" w:color="auto" w:val="clear"/>
+            <w:tcMar>
+              <w:top w:type="dxa" w:w="70"/>
+              <w:left w:type="dxa" w:w="100"/>
+              <w:bottom w:type="dxa" w:w="70"/>
+              <w:right w:type="dxa" w:w="100"/>
+            </w:tcMar>
+          </w:tcPr>
+          <w:p>
+            <w:pPr>
+              <w:spacing w:after="0" w:before="0"/>
+            </w:pPr>
+            <w:r>
+              <w:rPr>
+                <w:sz w:val="18"/>
+                <w:szCs w:val="18"/>
+              </w:rPr>
+              <w:t xml:space="preserve">46–53</w:t>
+            </w:r>
+          </w:p>
+        </w:tc>
+        <w:tc>
+          <w:tcPr>
+            <w:tcW w:type="dxa" w:w="1650"/>
+            <w:tcBorders>
+              <w:top w:val="single" w:color="BFB5A5" w:sz="4"/>
+              <w:left w:val="single" w:color="BFB5A5" w:sz="4"/>
+              <w:bottom w:val="single" w:color="BFB5A5" w:sz="4"/>
+              <w:right w:val="single" w:color="BFB5A5" w:sz="4"/>
+            </w:tcBorders>
+            <w:tcMar>
+              <w:top w:type="dxa" w:w="70"/>
+              <w:left w:type="dxa" w:w="100"/>
+              <w:bottom w:type="dxa" w:w="70"/>
+              <w:right w:type="dxa" w:w="100"/>
+            </w:tcMar>
+          </w:tcPr>
+          <w:p>
+            <w:pPr>
+              <w:spacing w:after="0" w:before="0"/>
+            </w:pPr>
+            <w:r>
+              <w:rPr>
+                <w:sz w:val="18"/>
+                <w:szCs w:val="18"/>
+              </w:rPr>
+              <w:t xml:space="preserve">Sachurteil</w:t>
+            </w:r>
+          </w:p>
+        </w:tc>
+        <w:tc>
+          <w:tcPr>
+            <w:tcW w:type="dxa" w:w="4188"/>
+            <w:tcBorders>
+              <w:top w:val="single" w:color="BFB5A5" w:sz="4"/>
+              <w:left w:val="single" w:color="BFB5A5" w:sz="4"/>
+              <w:bottom w:val="single" w:color="BFB5A5" w:sz="4"/>
+              <w:right w:val="single" w:color="BFB5A5" w:sz="4"/>
+            </w:tcBorders>
+            <w:tcMar>
+              <w:top w:type="dxa" w:w="70"/>
+              <w:left w:type="dxa" w:w="100"/>
+              <w:bottom w:type="dxa" w:w="70"/>
+              <w:right w:type="dxa" w:w="100"/>
+            </w:tcMar>
+          </w:tcPr>
+          <w:p>
+            <w:pPr>
+              <w:spacing w:after="0" w:before="0"/>
+            </w:pPr>
+            <w:r>
+              <w:rPr>
+                <w:sz w:val="18"/>
+                <w:szCs w:val="18"/>
+              </w:rPr>
+              <w:t xml:space="preserve">Urteilsblatt: „War Solons Verfassung eher demokratisch oder eher timokratisch?“ Danach still mit dem Beispiel vergleichen.</w:t>
+            </w:r>
+          </w:p>
+        </w:tc>
+        <w:tc>
+          <w:tcPr>
+            <w:tcW w:type="dxa" w:w="1450"/>
+            <w:tcBorders>
+              <w:top w:val="single" w:color="BFB5A5" w:sz="4"/>
+              <w:left w:val="single" w:color="BFB5A5" w:sz="4"/>
+              <w:bottom w:val="single" w:color="BFB5A5" w:sz="4"/>
+              <w:right w:val="single" w:color="BFB5A5" w:sz="4"/>
+            </w:tcBorders>
+            <w:tcMar>
+              <w:top w:type="dxa" w:w="70"/>
+              <w:left w:type="dxa" w:w="100"/>
+              <w:bottom w:type="dxa" w:w="70"/>
+              <w:right w:type="dxa" w:w="100"/>
+            </w:tcMar>
+          </w:tcPr>
+          <w:p>
+            <w:pPr>
+              <w:spacing w:after="0" w:before="0"/>
+            </w:pPr>
+            <w:r>
+              <w:rPr>
+                <w:sz w:val="18"/>
+                <w:szCs w:val="18"/>
+              </w:rPr>
               <w:t xml:space="preserve">EA</w:t>
             </w:r>
           </w:p>
@@ -2006,7 +2263,460 @@
                 <w:sz w:val="18"/>
                 <w:szCs w:val="18"/>
               </w:rPr>
-              <w:t xml:space="preserve">–</w:t>
+              <w:t xml:space="preserve">13–14</w:t>
+            </w:r>
+          </w:p>
+        </w:tc>
+      </w:tr>
+      <w:tr>
+        <w:trPr>
+          <w:cantSplit/>
+        </w:trPr>
+        <w:tc>
+          <w:tcPr>
+            <w:tcW w:type="dxa" w:w="850"/>
+            <w:tcBorders>
+              <w:top w:val="single" w:color="BFB5A5" w:sz="4"/>
+              <w:left w:val="single" w:color="BFB5A5" w:sz="4"/>
+              <w:bottom w:val="single" w:color="BFB5A5" w:sz="4"/>
+              <w:right w:val="single" w:color="BFB5A5" w:sz="4"/>
+            </w:tcBorders>
+            <w:shd w:fill="F4ECDE" w:color="auto" w:val="clear"/>
+            <w:tcMar>
+              <w:top w:type="dxa" w:w="70"/>
+              <w:left w:type="dxa" w:w="100"/>
+              <w:bottom w:type="dxa" w:w="70"/>
+              <w:right w:type="dxa" w:w="100"/>
+            </w:tcMar>
+          </w:tcPr>
+          <w:p>
+            <w:pPr>
+              <w:spacing w:after="0" w:before="0"/>
+            </w:pPr>
+            <w:r>
+              <w:rPr>
+                <w:sz w:val="18"/>
+                <w:szCs w:val="18"/>
+              </w:rPr>
+              <w:t xml:space="preserve">53–60</w:t>
+            </w:r>
+          </w:p>
+        </w:tc>
+        <w:tc>
+          <w:tcPr>
+            <w:tcW w:type="dxa" w:w="1650"/>
+            <w:tcBorders>
+              <w:top w:val="single" w:color="BFB5A5" w:sz="4"/>
+              <w:left w:val="single" w:color="BFB5A5" w:sz="4"/>
+              <w:bottom w:val="single" w:color="BFB5A5" w:sz="4"/>
+              <w:right w:val="single" w:color="BFB5A5" w:sz="4"/>
+            </w:tcBorders>
+            <w:tcMar>
+              <w:top w:type="dxa" w:w="70"/>
+              <w:left w:type="dxa" w:w="100"/>
+              <w:bottom w:type="dxa" w:w="70"/>
+              <w:right w:type="dxa" w:w="100"/>
+            </w:tcMar>
+          </w:tcPr>
+          <w:p>
+            <w:pPr>
+              <w:spacing w:after="0" w:before="0"/>
+            </w:pPr>
+            <w:r>
+              <w:rPr>
+                <w:sz w:val="18"/>
+                <w:szCs w:val="18"/>
+              </w:rPr>
+              <w:t xml:space="preserve">Werturteil</w:t>
+            </w:r>
+          </w:p>
+        </w:tc>
+        <w:tc>
+          <w:tcPr>
+            <w:tcW w:type="dxa" w:w="4188"/>
+            <w:tcBorders>
+              <w:top w:val="single" w:color="BFB5A5" w:sz="4"/>
+              <w:left w:val="single" w:color="BFB5A5" w:sz="4"/>
+              <w:bottom w:val="single" w:color="BFB5A5" w:sz="4"/>
+              <w:right w:val="single" w:color="BFB5A5" w:sz="4"/>
+            </w:tcBorders>
+            <w:tcMar>
+              <w:top w:type="dxa" w:w="70"/>
+              <w:left w:type="dxa" w:w="100"/>
+              <w:bottom w:type="dxa" w:w="70"/>
+              <w:right w:type="dxa" w:w="100"/>
+            </w:tcMar>
+          </w:tcPr>
+          <w:p>
+            <w:pPr>
+              <w:spacing w:after="0" w:before="0"/>
+            </w:pPr>
+            <w:r>
+              <w:rPr>
+                <w:sz w:val="18"/>
+                <w:szCs w:val="18"/>
+              </w:rPr>
+              <w:t xml:space="preserve">Alle dieselbe Frage: „Ist es gerecht, dass die Ämter vom Besitz abhängen?“ Jeder wählt seinen Maßstab (1–4) und begründet.</w:t>
+            </w:r>
+          </w:p>
+        </w:tc>
+        <w:tc>
+          <w:tcPr>
+            <w:tcW w:type="dxa" w:w="1450"/>
+            <w:tcBorders>
+              <w:top w:val="single" w:color="BFB5A5" w:sz="4"/>
+              <w:left w:val="single" w:color="BFB5A5" w:sz="4"/>
+              <w:bottom w:val="single" w:color="BFB5A5" w:sz="4"/>
+              <w:right w:val="single" w:color="BFB5A5" w:sz="4"/>
+            </w:tcBorders>
+            <w:tcMar>
+              <w:top w:type="dxa" w:w="70"/>
+              <w:left w:type="dxa" w:w="100"/>
+              <w:bottom w:type="dxa" w:w="70"/>
+              <w:right w:type="dxa" w:w="100"/>
+            </w:tcMar>
+          </w:tcPr>
+          <w:p>
+            <w:pPr>
+              <w:spacing w:after="0" w:before="0"/>
+            </w:pPr>
+            <w:r>
+              <w:rPr>
+                <w:sz w:val="18"/>
+                <w:szCs w:val="18"/>
+              </w:rPr>
+              <w:t xml:space="preserve">EA</w:t>
+            </w:r>
+          </w:p>
+        </w:tc>
+        <w:tc>
+          <w:tcPr>
+            <w:tcW w:type="dxa" w:w="1500"/>
+            <w:tcBorders>
+              <w:top w:val="single" w:color="BFB5A5" w:sz="4"/>
+              <w:left w:val="single" w:color="BFB5A5" w:sz="4"/>
+              <w:bottom w:val="single" w:color="BFB5A5" w:sz="4"/>
+              <w:right w:val="single" w:color="BFB5A5" w:sz="4"/>
+            </w:tcBorders>
+            <w:tcMar>
+              <w:top w:type="dxa" w:w="70"/>
+              <w:left w:type="dxa" w:w="100"/>
+              <w:bottom w:type="dxa" w:w="70"/>
+              <w:right w:type="dxa" w:w="100"/>
+            </w:tcMar>
+          </w:tcPr>
+          <w:p>
+            <w:pPr>
+              <w:spacing w:after="0" w:before="0"/>
+            </w:pPr>
+            <w:r>
+              <w:rPr>
+                <w:sz w:val="18"/>
+                <w:szCs w:val="18"/>
+              </w:rPr>
+              <w:t xml:space="preserve">15</w:t>
+            </w:r>
+          </w:p>
+        </w:tc>
+      </w:tr>
+      <w:tr>
+        <w:trPr>
+          <w:cantSplit/>
+        </w:trPr>
+        <w:tc>
+          <w:tcPr>
+            <w:tcW w:type="dxa" w:w="850"/>
+            <w:tcBorders>
+              <w:top w:val="single" w:color="BFB5A5" w:sz="4"/>
+              <w:left w:val="single" w:color="BFB5A5" w:sz="4"/>
+              <w:bottom w:val="single" w:color="BFB5A5" w:sz="4"/>
+              <w:right w:val="single" w:color="BFB5A5" w:sz="4"/>
+            </w:tcBorders>
+            <w:shd w:fill="F4ECDE" w:color="auto" w:val="clear"/>
+            <w:tcMar>
+              <w:top w:type="dxa" w:w="70"/>
+              <w:left w:type="dxa" w:w="100"/>
+              <w:bottom w:type="dxa" w:w="70"/>
+              <w:right w:type="dxa" w:w="100"/>
+            </w:tcMar>
+          </w:tcPr>
+          <w:p>
+            <w:pPr>
+              <w:spacing w:after="0" w:before="0"/>
+            </w:pPr>
+            <w:r>
+              <w:rPr>
+                <w:sz w:val="18"/>
+                <w:szCs w:val="18"/>
+              </w:rPr>
+              <w:t xml:space="preserve">60–65</w:t>
+            </w:r>
+          </w:p>
+        </w:tc>
+        <w:tc>
+          <w:tcPr>
+            <w:tcW w:type="dxa" w:w="1650"/>
+            <w:tcBorders>
+              <w:top w:val="single" w:color="BFB5A5" w:sz="4"/>
+              <w:left w:val="single" w:color="BFB5A5" w:sz="4"/>
+              <w:bottom w:val="single" w:color="BFB5A5" w:sz="4"/>
+              <w:right w:val="single" w:color="BFB5A5" w:sz="4"/>
+            </w:tcBorders>
+            <w:tcMar>
+              <w:top w:type="dxa" w:w="70"/>
+              <w:left w:type="dxa" w:w="100"/>
+              <w:bottom w:type="dxa" w:w="70"/>
+              <w:right w:type="dxa" w:w="100"/>
+            </w:tcMar>
+          </w:tcPr>
+          <w:p>
+            <w:pPr>
+              <w:spacing w:after="0" w:before="0"/>
+            </w:pPr>
+            <w:r>
+              <w:rPr>
+                <w:sz w:val="18"/>
+                <w:szCs w:val="18"/>
+              </w:rPr>
+              <w:t xml:space="preserve">Feedback</w:t>
+            </w:r>
+          </w:p>
+        </w:tc>
+        <w:tc>
+          <w:tcPr>
+            <w:tcW w:type="dxa" w:w="4188"/>
+            <w:tcBorders>
+              <w:top w:val="single" w:color="BFB5A5" w:sz="4"/>
+              <w:left w:val="single" w:color="BFB5A5" w:sz="4"/>
+              <w:bottom w:val="single" w:color="BFB5A5" w:sz="4"/>
+              <w:right w:val="single" w:color="BFB5A5" w:sz="4"/>
+            </w:tcBorders>
+            <w:tcMar>
+              <w:top w:type="dxa" w:w="70"/>
+              <w:left w:type="dxa" w:w="100"/>
+              <w:bottom w:type="dxa" w:w="70"/>
+              <w:right w:type="dxa" w:w="100"/>
+            </w:tcMar>
+          </w:tcPr>
+          <w:p>
+            <w:pPr>
+              <w:spacing w:after="0" w:before="0"/>
+            </w:pPr>
+            <w:r>
+              <w:rPr>
+                <w:sz w:val="18"/>
+                <w:szCs w:val="18"/>
+              </w:rPr>
+              <w:t xml:space="preserve">Blätter tauschen, Checkliste auf dem Blatt ausfüllen, einen Tipp schreiben.</w:t>
+            </w:r>
+          </w:p>
+        </w:tc>
+        <w:tc>
+          <w:tcPr>
+            <w:tcW w:type="dxa" w:w="1450"/>
+            <w:tcBorders>
+              <w:top w:val="single" w:color="BFB5A5" w:sz="4"/>
+              <w:left w:val="single" w:color="BFB5A5" w:sz="4"/>
+              <w:bottom w:val="single" w:color="BFB5A5" w:sz="4"/>
+              <w:right w:val="single" w:color="BFB5A5" w:sz="4"/>
+            </w:tcBorders>
+            <w:tcMar>
+              <w:top w:type="dxa" w:w="70"/>
+              <w:left w:type="dxa" w:w="100"/>
+              <w:bottom w:type="dxa" w:w="70"/>
+              <w:right w:type="dxa" w:w="100"/>
+            </w:tcMar>
+          </w:tcPr>
+          <w:p>
+            <w:pPr>
+              <w:spacing w:after="0" w:before="0"/>
+            </w:pPr>
+            <w:r>
+              <w:rPr>
+                <w:sz w:val="18"/>
+                <w:szCs w:val="18"/>
+              </w:rPr>
+              <w:t xml:space="preserve">PA</w:t>
+            </w:r>
+          </w:p>
+        </w:tc>
+        <w:tc>
+          <w:tcPr>
+            <w:tcW w:type="dxa" w:w="1500"/>
+            <w:tcBorders>
+              <w:top w:val="single" w:color="BFB5A5" w:sz="4"/>
+              <w:left w:val="single" w:color="BFB5A5" w:sz="4"/>
+              <w:bottom w:val="single" w:color="BFB5A5" w:sz="4"/>
+              <w:right w:val="single" w:color="BFB5A5" w:sz="4"/>
+            </w:tcBorders>
+            <w:tcMar>
+              <w:top w:type="dxa" w:w="70"/>
+              <w:left w:type="dxa" w:w="100"/>
+              <w:bottom w:type="dxa" w:w="70"/>
+              <w:right w:type="dxa" w:w="100"/>
+            </w:tcMar>
+          </w:tcPr>
+          <w:p>
+            <w:pPr>
+              <w:spacing w:after="0" w:before="0"/>
+            </w:pPr>
+            <w:r>
+              <w:rPr>
+                <w:sz w:val="18"/>
+                <w:szCs w:val="18"/>
+              </w:rPr>
+              <w:t xml:space="preserve">16</w:t>
+            </w:r>
+          </w:p>
+        </w:tc>
+      </w:tr>
+      <w:tr>
+        <w:trPr>
+          <w:cantSplit/>
+        </w:trPr>
+        <w:tc>
+          <w:tcPr>
+            <w:tcW w:type="dxa" w:w="850"/>
+            <w:tcBorders>
+              <w:top w:val="single" w:color="BFB5A5" w:sz="4"/>
+              <w:left w:val="single" w:color="BFB5A5" w:sz="4"/>
+              <w:bottom w:val="single" w:color="BFB5A5" w:sz="4"/>
+              <w:right w:val="single" w:color="BFB5A5" w:sz="4"/>
+            </w:tcBorders>
+            <w:shd w:fill="F4ECDE" w:color="auto" w:val="clear"/>
+            <w:tcMar>
+              <w:top w:type="dxa" w:w="70"/>
+              <w:left w:type="dxa" w:w="100"/>
+              <w:bottom w:type="dxa" w:w="70"/>
+              <w:right w:type="dxa" w:w="100"/>
+            </w:tcMar>
+          </w:tcPr>
+          <w:p>
+            <w:pPr>
+              <w:spacing w:after="0" w:before="0"/>
+            </w:pPr>
+            <w:r>
+              <w:rPr>
+                <w:sz w:val="18"/>
+                <w:szCs w:val="18"/>
+              </w:rPr>
+              <w:t xml:space="preserve">65–70</w:t>
+            </w:r>
+          </w:p>
+        </w:tc>
+        <w:tc>
+          <w:tcPr>
+            <w:tcW w:type="dxa" w:w="1650"/>
+            <w:tcBorders>
+              <w:top w:val="single" w:color="BFB5A5" w:sz="4"/>
+              <w:left w:val="single" w:color="BFB5A5" w:sz="4"/>
+              <w:bottom w:val="single" w:color="BFB5A5" w:sz="4"/>
+              <w:right w:val="single" w:color="BFB5A5" w:sz="4"/>
+            </w:tcBorders>
+            <w:tcMar>
+              <w:top w:type="dxa" w:w="70"/>
+              <w:left w:type="dxa" w:w="100"/>
+              <w:bottom w:type="dxa" w:w="70"/>
+              <w:right w:type="dxa" w:w="100"/>
+            </w:tcMar>
+          </w:tcPr>
+          <w:p>
+            <w:pPr>
+              <w:spacing w:after="0" w:before="0"/>
+            </w:pPr>
+            <w:r>
+              <w:rPr>
+                <w:sz w:val="18"/>
+                <w:szCs w:val="18"/>
+              </w:rPr>
+              <w:t xml:space="preserve">Beispiele, Merksatz</w:t>
+            </w:r>
+          </w:p>
+        </w:tc>
+        <w:tc>
+          <w:tcPr>
+            <w:tcW w:type="dxa" w:w="4188"/>
+            <w:tcBorders>
+              <w:top w:val="single" w:color="BFB5A5" w:sz="4"/>
+              <w:left w:val="single" w:color="BFB5A5" w:sz="4"/>
+              <w:bottom w:val="single" w:color="BFB5A5" w:sz="4"/>
+              <w:right w:val="single" w:color="BFB5A5" w:sz="4"/>
+            </w:tcBorders>
+            <w:tcMar>
+              <w:top w:type="dxa" w:w="70"/>
+              <w:left w:type="dxa" w:w="100"/>
+              <w:bottom w:type="dxa" w:w="70"/>
+              <w:right w:type="dxa" w:w="100"/>
+            </w:tcMar>
+          </w:tcPr>
+          <w:p>
+            <w:pPr>
+              <w:spacing w:after="0" w:before="0"/>
+            </w:pPr>
+            <w:r>
+              <w:rPr>
+                <w:sz w:val="18"/>
+                <w:szCs w:val="18"/>
+              </w:rPr>
+              <w:t xml:space="preserve">Optional zwei Schülerurteile vorlesen (gelungen / zu verbessern). Zwei Beispielurteile mit verschiedenen Maßstäben. Urteilsblätter einsammeln.</w:t>
+            </w:r>
+          </w:p>
+        </w:tc>
+        <w:tc>
+          <w:tcPr>
+            <w:tcW w:type="dxa" w:w="1450"/>
+            <w:tcBorders>
+              <w:top w:val="single" w:color="BFB5A5" w:sz="4"/>
+              <w:left w:val="single" w:color="BFB5A5" w:sz="4"/>
+              <w:bottom w:val="single" w:color="BFB5A5" w:sz="4"/>
+              <w:right w:val="single" w:color="BFB5A5" w:sz="4"/>
+            </w:tcBorders>
+            <w:tcMar>
+              <w:top w:type="dxa" w:w="70"/>
+              <w:left w:type="dxa" w:w="100"/>
+              <w:bottom w:type="dxa" w:w="70"/>
+              <w:right w:type="dxa" w:w="100"/>
+            </w:tcMar>
+          </w:tcPr>
+          <w:p>
+            <w:pPr>
+              <w:spacing w:after="0" w:before="0"/>
+            </w:pPr>
+            <w:r>
+              <w:rPr>
+                <w:sz w:val="18"/>
+                <w:szCs w:val="18"/>
+              </w:rPr>
+              <w:t xml:space="preserve">Plenum</w:t>
+            </w:r>
+          </w:p>
+        </w:tc>
+        <w:tc>
+          <w:tcPr>
+            <w:tcW w:type="dxa" w:w="1500"/>
+            <w:tcBorders>
+              <w:top w:val="single" w:color="BFB5A5" w:sz="4"/>
+              <w:left w:val="single" w:color="BFB5A5" w:sz="4"/>
+              <w:bottom w:val="single" w:color="BFB5A5" w:sz="4"/>
+              <w:right w:val="single" w:color="BFB5A5" w:sz="4"/>
+            </w:tcBorders>
+            <w:tcMar>
+              <w:top w:type="dxa" w:w="70"/>
+              <w:left w:type="dxa" w:w="100"/>
+              <w:bottom w:type="dxa" w:w="70"/>
+              <w:right w:type="dxa" w:w="100"/>
+            </w:tcMar>
+          </w:tcPr>
+          <w:p>
+            <w:pPr>
+              <w:spacing w:after="0" w:before="0"/>
+            </w:pPr>
+            <w:r>
+              <w:rPr>
+                <w:sz w:val="18"/>
+                <w:szCs w:val="18"/>
+              </w:rPr>
+              <w:t xml:space="preserve">17</w:t>
             </w:r>
           </w:p>
         </w:tc>
@@ -2094,6 +2804,27 @@
     </w:p>
     <w:p>
       <w:pPr>
+        <w:spacing w:after="80" w:before="0"/>
+      </w:pPr>
+      <w:r>
+        <w:rPr>
+          <w:b/>
+          <w:bCs/>
+          <w:sz w:val="19"/>
+          <w:szCs w:val="19"/>
+        </w:rPr>
+        <w:t xml:space="preserve">Urteilsblatt:</w:t>
+      </w:r>
+      <w:r>
+        <w:rPr>
+          <w:sz w:val="19"/>
+          <w:szCs w:val="19"/>
+        </w:rPr>
+        <w:t xml:space="preserve"> Alle beantworten dieselben Fragen. Eingesammelt zeigt das Blatt, wie sicher die Klasse Sach- und Werturteil inzwischen trennt: Ist das Sachurteil aus der damaligen Zeit heraus begründet? Wird beim Werturteil der Maßstab genannt? Unterschiedliche Werturteile sind richtig, wenn sie begründet sind.</w:t>
+      </w:r>
+    </w:p>
+    <w:p>
+      <w:pPr>
         <w:keepNext/>
         <w:spacing w:after="100" w:before="220"/>
       </w:pPr>
@@ -3363,6 +4094,48 @@
         </w:tc>
       </w:tr>
     </w:tbl>
+    <w:p>
+      <w:pPr>
+        <w:spacing w:after="80" w:before="100"/>
+      </w:pPr>
+      <w:r>
+        <w:rPr>
+          <w:b/>
+          <w:bCs/>
+          <w:sz w:val="18"/>
+          <w:szCs w:val="18"/>
+        </w:rPr>
+        <w:t xml:space="preserve">Sachurteil (Beispiel):</w:t>
+      </w:r>
+      <w:r>
+        <w:rPr>
+          <w:sz w:val="18"/>
+          <w:szCs w:val="18"/>
+        </w:rPr>
+        <w:t xml:space="preserve"> Eher timokratisch, denn die wichtigen Ämter blieben den Reichen vorbehalten (Anliegen 1, 4). Zwar stimmten alle Bürger in der Volksversammlung ab und durften klagen (Anliegen 2, 8), regieren konnten aber nur die Wohlhabenden. Auch „eher demokratisch“ ist mit Belegen vertretbar.</w:t>
+      </w:r>
+    </w:p>
+    <w:p>
+      <w:pPr>
+        <w:spacing w:after="80" w:before="0"/>
+      </w:pPr>
+      <w:r>
+        <w:rPr>
+          <w:b/>
+          <w:bCs/>
+          <w:sz w:val="18"/>
+          <w:szCs w:val="18"/>
+        </w:rPr>
+        <w:t xml:space="preserve">Werturteil (Beispiele):</w:t>
+      </w:r>
+      <w:r>
+        <w:rPr>
+          <w:sz w:val="18"/>
+          <w:szCs w:val="18"/>
+        </w:rPr>
+        <w:t xml:space="preserve"> Maßstab Gleichheit: nicht gerecht, weil arme Bürger nie regieren konnten. Maßstab Leistung: teilweise gerecht, weil die Reichen mehr Lasten trugen und Aufstieg möglich war. Schutz der Schwachen: teilweise (Schuldenerlass, Klagerecht, aber keine Ämter). Gleiche Regeln: teilweise (gleiche Regel für alle Bürger, Frauen ausgeschlossen).</w:t>
+      </w:r>
+    </w:p>
     <w:sectPr>
       <w:headerReference w:type="default" r:id="rId7"/>
       <w:pgSz w:w="11906" w:h="16838" w:orient="portrait"/>

</xml_diff>

<commit_message>
Geschichte 11: Urteile im Hefter statt Urteilsblatt, Maßstäbe auf der Folie
Co-Authored-By: Claude Opus 5.5 <noreply@anthropic.com>
Claude-Session: https://claude.ai/code/session_013iN4Tiarea1J9YUJHZ9iqC
</commit_message>
<xml_diff>
--- a/Geschichte_11/Stunde_Buergeramt_Athen/Handreichung_Buergeramt_Athen.docx
+++ b/Geschichte_11/Stunde_Buergeramt_Athen/Handreichung_Buergeramt_Athen.docx
@@ -531,112 +531,6 @@
           </w:p>
         </w:tc>
       </w:tr>
-      <w:tr>
-        <w:trPr>
-          <w:cantSplit/>
-        </w:trPr>
-        <w:tc>
-          <w:tcPr>
-            <w:tcW w:type="dxa" w:w="3200"/>
-            <w:tcBorders>
-              <w:top w:val="single" w:color="BFB5A5" w:sz="4"/>
-              <w:left w:val="single" w:color="BFB5A5" w:sz="4"/>
-              <w:bottom w:val="single" w:color="BFB5A5" w:sz="4"/>
-              <w:right w:val="single" w:color="BFB5A5" w:sz="4"/>
-            </w:tcBorders>
-            <w:tcMar>
-              <w:top w:type="dxa" w:w="70"/>
-              <w:left w:type="dxa" w:w="100"/>
-              <w:bottom w:type="dxa" w:w="70"/>
-              <w:right w:type="dxa" w:w="100"/>
-            </w:tcMar>
-          </w:tcPr>
-          <w:p>
-            <w:pPr>
-              <w:spacing w:after="30" w:before="0"/>
-            </w:pPr>
-            <w:r>
-              <w:rPr>
-                <w:b/>
-                <w:bCs/>
-                <w:sz w:val="18"/>
-                <w:szCs w:val="18"/>
-              </w:rPr>
-              <w:t xml:space="preserve">Urteilsblatt</w:t>
-            </w:r>
-          </w:p>
-          <w:p>
-            <w:pPr>
-              <w:spacing w:after="30" w:before="0"/>
-            </w:pPr>
-            <w:r>
-              <w:rPr>
-                <w:sz w:val="18"/>
-                <w:szCs w:val="18"/>
-              </w:rPr>
-              <w:t xml:space="preserve">Urteilsblatt_A5.docx</w:t>
-            </w:r>
-          </w:p>
-        </w:tc>
-        <w:tc>
-          <w:tcPr>
-            <w:tcW w:type="dxa" w:w="2300"/>
-            <w:tcBorders>
-              <w:top w:val="single" w:color="BFB5A5" w:sz="4"/>
-              <w:left w:val="single" w:color="BFB5A5" w:sz="4"/>
-              <w:bottom w:val="single" w:color="BFB5A5" w:sz="4"/>
-              <w:right w:val="single" w:color="BFB5A5" w:sz="4"/>
-            </w:tcBorders>
-            <w:tcMar>
-              <w:top w:type="dxa" w:w="70"/>
-              <w:left w:type="dxa" w:w="100"/>
-              <w:bottom w:type="dxa" w:w="70"/>
-              <w:right w:type="dxa" w:w="100"/>
-            </w:tcMar>
-          </w:tcPr>
-          <w:p>
-            <w:pPr>
-              <w:spacing w:after="0" w:before="0"/>
-            </w:pPr>
-            <w:r>
-              <w:rPr>
-                <w:sz w:val="18"/>
-                <w:szCs w:val="18"/>
-              </w:rPr>
-              <w:t xml:space="preserve">halb so viele Blätter wie Schüler</w:t>
-            </w:r>
-          </w:p>
-        </w:tc>
-        <w:tc>
-          <w:tcPr>
-            <w:tcW w:type="dxa" w:w="4138"/>
-            <w:tcBorders>
-              <w:top w:val="single" w:color="BFB5A5" w:sz="4"/>
-              <w:left w:val="single" w:color="BFB5A5" w:sz="4"/>
-              <w:bottom w:val="single" w:color="BFB5A5" w:sz="4"/>
-              <w:right w:val="single" w:color="BFB5A5" w:sz="4"/>
-            </w:tcBorders>
-            <w:tcMar>
-              <w:top w:type="dxa" w:w="70"/>
-              <w:left w:type="dxa" w:w="100"/>
-              <w:bottom w:type="dxa" w:w="70"/>
-              <w:right w:type="dxa" w:w="100"/>
-            </w:tcMar>
-          </w:tcPr>
-          <w:p>
-            <w:pPr>
-              <w:spacing w:after="0" w:before="0"/>
-            </w:pPr>
-            <w:r>
-              <w:rPr>
-                <w:sz w:val="18"/>
-                <w:szCs w:val="18"/>
-              </w:rPr>
-              <w:t xml:space="preserve">A4 quer, 2 Exemplare pro Blatt. Wird am Ende eingesammelt (Diagnose).</w:t>
-            </w:r>
-          </w:p>
-        </w:tc>
-      </w:tr>
     </w:tbl>
     <w:p>
       <w:pPr>
@@ -2205,7 +2099,7 @@
                 <w:sz w:val="18"/>
                 <w:szCs w:val="18"/>
               </w:rPr>
-              <w:t xml:space="preserve">Urteilsblatt: „War Solons Verfassung eher demokratisch oder eher timokratisch?“ Danach still mit dem Beispiel vergleichen.</w:t>
+              <w:t xml:space="preserve">Im Hefter: „War Solons Verfassung eher demokratisch oder eher timokratisch?“ Danach still mit dem Beispiel vergleichen.</w:t>
             </w:r>
           </w:p>
         </w:tc>
@@ -2356,7 +2250,7 @@
                 <w:sz w:val="18"/>
                 <w:szCs w:val="18"/>
               </w:rPr>
-              <w:t xml:space="preserve">Alle dieselbe Frage: „Ist es gerecht, dass die Ämter vom Besitz abhängen?“ Jeder wählt seinen Maßstab (1–4) und begründet.</w:t>
+              <w:t xml:space="preserve">Alle dieselbe Frage: „Ist es gerecht, dass die Ämter vom Besitz abhängen?“ Jeder wählt einen der vier Maßstäbe auf der Folie und begründet im Hefter.</w:t>
             </w:r>
           </w:p>
         </w:tc>
@@ -2507,7 +2401,7 @@
                 <w:sz w:val="18"/>
                 <w:szCs w:val="18"/>
               </w:rPr>
-              <w:t xml:space="preserve">Blätter tauschen, Checkliste auf dem Blatt ausfüllen, einen Tipp schreiben.</w:t>
+              <w:t xml:space="preserve">Hefter tauschen, Urteile mit der Checkliste auf der Folie prüfen, einen Tipp darunter schreiben.</w:t>
             </w:r>
           </w:p>
         </w:tc>
@@ -2658,7 +2552,7 @@
                 <w:sz w:val="18"/>
                 <w:szCs w:val="18"/>
               </w:rPr>
-              <w:t xml:space="preserve">Optional zwei Schülerurteile vorlesen (gelungen / zu verbessern). Zwei Beispielurteile mit verschiedenen Maßstäben. Urteilsblätter einsammeln.</w:t>
+              <w:t xml:space="preserve">Optional zwei Schülerurteile vorlesen (gelungen / zu verbessern). Zwei Beispielurteile mit verschiedenen Maßstäben. Bei Bedarf Hefter einsammeln.</w:t>
             </w:r>
           </w:p>
         </w:tc>
@@ -2813,14 +2707,14 @@
           <w:sz w:val="19"/>
           <w:szCs w:val="19"/>
         </w:rPr>
-        <w:t xml:space="preserve">Urteilsblatt:</w:t>
+        <w:t xml:space="preserve">Urteile im Hefter:</w:t>
       </w:r>
       <w:r>
         <w:rPr>
           <w:sz w:val="19"/>
           <w:szCs w:val="19"/>
         </w:rPr>
-        <w:t xml:space="preserve"> Alle beantworten dieselben Fragen. Eingesammelt zeigt das Blatt, wie sicher die Klasse Sach- und Werturteil inzwischen trennt: Ist das Sachurteil aus der damaligen Zeit heraus begründet? Wird beim Werturteil der Maßstab genannt? Unterschiedliche Werturteile sind richtig, wenn sie begründet sind.</w:t>
+        <w:t xml:space="preserve"> Alle beantworten dieselben Fragen. Eingesammelte Hefter zeigen, wie sicher die Klasse Sach- und Werturteil inzwischen trennt: Ist das Sachurteil aus der damaligen Zeit heraus begründet? Wird beim Werturteil der Maßstab genannt? Unterschiedliche Werturteile sind richtig, wenn sie begründet sind.</w:t>
       </w:r>
     </w:p>
     <w:p>

</xml_diff>

<commit_message>
Bürgeramt Athen: neue Werturteilsfrage „Eine Verfassung für alle Bürger?“
Co-Authored-By: Claude Opus 5.5 <noreply@anthropic.com>
Claude-Session: https://claude.ai/code/session_013iN4Tiarea1J9YUJHZ9iqC
</commit_message>
<xml_diff>
--- a/Geschichte_11/Stunde_Buergeramt_Athen/Handreichung_Buergeramt_Athen.docx
+++ b/Geschichte_11/Stunde_Buergeramt_Athen/Handreichung_Buergeramt_Athen.docx
@@ -2250,7 +2250,7 @@
                 <w:sz w:val="18"/>
                 <w:szCs w:val="18"/>
               </w:rPr>
-              <w:t xml:space="preserve">Alle dieselbe Frage: „Ist es gerecht, dass die Ämter vom Besitz abhängen?“ Jeder wählt einen der vier Maßstäbe auf der Folie und begründet im Hefter.</w:t>
+              <w:t xml:space="preserve">Alle dieselbe Frage: „Solons Verfassungsreform – eine Verfassung für alle Bürger?“ Jeder wählt einen der vier Maßstäbe auf der Folie und begründet im Hefter.</w:t>
             </w:r>
           </w:p>
         </w:tc>
@@ -4027,7 +4027,7 @@
           <w:sz w:val="18"/>
           <w:szCs w:val="18"/>
         </w:rPr>
-        <w:t xml:space="preserve"> Maßstab Gleichheit: nicht gerecht, weil arme Bürger nie regieren konnten. Maßstab Leistung: teilweise gerecht, weil die Reichen mehr Lasten trugen und Aufstieg möglich war. Schutz der Schwachen: teilweise (Schuldenerlass, Klagerecht, aber keine Ämter). Gleiche Regeln: teilweise (gleiche Regel für alle Bürger, Frauen ausgeschlossen).</w:t>
+        <w:t xml:space="preserve"> Maßstab Gleichheit: keine Verfassung für alle, weil Theten kein Amt bekamen und Frauen ganz ausgeschlossen waren. Maßstab Leistung: teilweise, weil Aufstieg durch Besitz möglich war, nicht mehr die Herkunft zählte. Schutz der Schwachen: teilweise (Schuldenerlass, Klagerecht und Stimme in der Volksversammlung für alle Bürger, aber keine Ämter für Arme). Gleiche Regeln: teilweise (dieselben Scheffelgrenzen für alle Bürger, aber Frauen, Sklaven und Fremde ausgeschlossen).</w:t>
       </w:r>
     </w:p>
     <w:sectPr>

</xml_diff>

<commit_message>
Bürgeramt Athen: Handreichung an die 19 Folien der Lehrkraft angepasst
Co-Authored-By: Claude Opus 5.5 <noreply@anthropic.com>
Claude-Session: https://claude.ai/code/session_013iN4Tiarea1J9YUJHZ9iqC
</commit_message>
<xml_diff>
--- a/Geschichte_11/Stunde_Buergeramt_Athen/Handreichung_Buergeramt_Athen.docx
+++ b/Geschichte_11/Stunde_Buergeramt_Athen/Handreichung_Buergeramt_Athen.docx
@@ -244,7 +244,7 @@
                 <w:sz w:val="18"/>
                 <w:szCs w:val="18"/>
               </w:rPr>
-              <w:t xml:space="preserve">Anliegenkarten</w:t>
+              <w:t xml:space="preserve">Anliegenkarten (A5)</w:t>
             </w:r>
           </w:p>
           <w:p>
@@ -256,7 +256,7 @@
                 <w:sz w:val="18"/>
                 <w:szCs w:val="18"/>
               </w:rPr>
-              <w:t xml:space="preserve">Anliegenkarten_Buergeramt.docx</w:t>
+              <w:t xml:space="preserve">Anliegenkarten_Tafel_A5.docx</w:t>
             </w:r>
           </w:p>
         </w:tc>
@@ -285,7 +285,7 @@
                 <w:sz w:val="18"/>
                 <w:szCs w:val="18"/>
               </w:rPr>
-              <w:t xml:space="preserve">1 × (3 Seiten)</w:t>
+              <w:t xml:space="preserve">1 × (5 Seiten)</w:t>
             </w:r>
           </w:p>
         </w:tc>
@@ -314,7 +314,7 @@
                 <w:sz w:val="18"/>
                 <w:szCs w:val="18"/>
               </w:rPr>
-              <w:t xml:space="preserve">In 9 Karten schneiden, eine pro Tisch.</w:t>
+              <w:t xml:space="preserve">An der gestrichelten Linie schneiden, eine Karte pro Tisch. Die Gruppe heftet sie danach mit Magneten an die Tafel. Magnete bereitlegen.</w:t>
             </w:r>
           </w:p>
         </w:tc>
@@ -582,7 +582,7 @@
           <w:sz w:val="20"/>
           <w:szCs w:val="20"/>
         </w:rPr>
-        <w:t xml:space="preserve">☐  Tafel: Tabelle mit den Spalten Nr. · Anliegen · ✔ · ✘ · weil … vorbereiten – oder Folie 6 aufs Whiteboard projizieren und direkt hineinschreiben lassen.</w:t>
+        <w:t xml:space="preserve">☐  Tafel: Tabelle mit den Spalten Nr. · Anliegen · ✔ · ✘ · weil … vorbereiten – oder Folie 7 aufs Whiteboard projizieren und direkt hineinschreiben lassen.</w:t>
       </w:r>
     </w:p>
     <w:p>
@@ -594,7 +594,7 @@
           <w:sz w:val="20"/>
           <w:szCs w:val="20"/>
         </w:rPr>
-        <w:t xml:space="preserve">☐  Die Schüler brauchen LB S. 21 (Schaubild) und ihr Heft.</w:t>
+        <w:t xml:space="preserve">☐  Das Schaubild aus LB S. 21 wird projiziert (Folie 6), die Schüler brauchen kein Buch, nur ihr Heft.</w:t>
       </w:r>
     </w:p>
     <w:p>
@@ -1100,7 +1100,7 @@
                 <w:sz w:val="18"/>
                 <w:szCs w:val="18"/>
               </w:rPr>
-              <w:t xml:space="preserve">6</w:t>
+              <w:t xml:space="preserve">4</w:t>
             </w:r>
           </w:p>
         </w:tc>
@@ -1193,7 +1193,7 @@
                 <w:sz w:val="18"/>
                 <w:szCs w:val="18"/>
               </w:rPr>
-              <w:t xml:space="preserve">Anliegen prüfen, genehmigt oder abgelehnt, jeder schreibt die Begründung ins Heft. Einen „Beamten“ für die Tafel bestimmen.</w:t>
+              <w:t xml:space="preserve">Anliegen prüfen, genehmigt oder abgelehnt, jeder schreibt die Begründung ins Heft. Einen „Beamten“ für die Tafel bestimmen. Das Buch-Schaubild bleibt dabei an der Wand (Folie 6).</w:t>
             </w:r>
           </w:p>
         </w:tc>
@@ -1251,7 +1251,7 @@
                 <w:sz w:val="18"/>
                 <w:szCs w:val="18"/>
               </w:rPr>
-              <w:t xml:space="preserve">5</w:t>
+              <w:t xml:space="preserve">5–6</w:t>
             </w:r>
           </w:p>
         </w:tc>
@@ -1402,7 +1402,7 @@
                 <w:sz w:val="18"/>
                 <w:szCs w:val="18"/>
               </w:rPr>
-              <w:t xml:space="preserve">6</w:t>
+              <w:t xml:space="preserve">7</w:t>
             </w:r>
           </w:p>
         </w:tc>
@@ -1553,7 +1553,7 @@
                 <w:sz w:val="18"/>
                 <w:szCs w:val="18"/>
               </w:rPr>
-              <w:t xml:space="preserve">7</w:t>
+              <w:t xml:space="preserve">8</w:t>
             </w:r>
           </w:p>
         </w:tc>
@@ -1704,7 +1704,7 @@
                 <w:sz w:val="18"/>
                 <w:szCs w:val="18"/>
               </w:rPr>
-              <w:t xml:space="preserve">8</w:t>
+              <w:t xml:space="preserve">9</w:t>
             </w:r>
           </w:p>
         </w:tc>
@@ -1855,7 +1855,7 @@
                 <w:sz w:val="18"/>
                 <w:szCs w:val="18"/>
               </w:rPr>
-              <w:t xml:space="preserve">9</w:t>
+              <w:t xml:space="preserve">10</w:t>
             </w:r>
           </w:p>
         </w:tc>
@@ -1948,7 +1948,7 @@
                 <w:sz w:val="18"/>
                 <w:szCs w:val="18"/>
               </w:rPr>
-              <w:t xml:space="preserve">Daumenabfrage (Erwartung: Nein). Paare ordnen sechs Merkmale „demokratisch“ / „timokratisch“ zu. Auflösung: beides.</w:t>
+              <w:t xml:space="preserve">Daumenabfrage (Erwartung: Nein). Begriff Timokratie klären (Folie 12). Paare ordnen sechs Merkmale „demokratisch“ / „timokratisch“ zu. Auflösung: beides.</w:t>
             </w:r>
           </w:p>
         </w:tc>
@@ -2006,7 +2006,7 @@
                 <w:sz w:val="18"/>
                 <w:szCs w:val="18"/>
               </w:rPr>
-              <w:t xml:space="preserve">10–12</w:t>
+              <w:t xml:space="preserve">11–14</w:t>
             </w:r>
           </w:p>
         </w:tc>
@@ -2157,7 +2157,7 @@
                 <w:sz w:val="18"/>
                 <w:szCs w:val="18"/>
               </w:rPr>
-              <w:t xml:space="preserve">13–14</w:t>
+              <w:t xml:space="preserve">15–16</w:t>
             </w:r>
           </w:p>
         </w:tc>
@@ -2308,7 +2308,7 @@
                 <w:sz w:val="18"/>
                 <w:szCs w:val="18"/>
               </w:rPr>
-              <w:t xml:space="preserve">15</w:t>
+              <w:t xml:space="preserve">17</w:t>
             </w:r>
           </w:p>
         </w:tc>
@@ -2459,7 +2459,7 @@
                 <w:sz w:val="18"/>
                 <w:szCs w:val="18"/>
               </w:rPr>
-              <w:t xml:space="preserve">16</w:t>
+              <w:t xml:space="preserve">18</w:t>
             </w:r>
           </w:p>
         </w:tc>
@@ -2523,7 +2523,7 @@
                 <w:sz w:val="18"/>
                 <w:szCs w:val="18"/>
               </w:rPr>
-              <w:t xml:space="preserve">Beispiele, Merksatz</w:t>
+              <w:t xml:space="preserve">Beispiele</w:t>
             </w:r>
           </w:p>
         </w:tc>
@@ -2610,7 +2610,7 @@
                 <w:sz w:val="18"/>
                 <w:szCs w:val="18"/>
               </w:rPr>
-              <w:t xml:space="preserve">17</w:t>
+              <w:t xml:space="preserve">19</w:t>
             </w:r>
           </w:p>
         </w:tc>
@@ -2693,7 +2693,7 @@
           <w:sz w:val="19"/>
           <w:szCs w:val="19"/>
         </w:rPr>
-        <w:t xml:space="preserve"> Es fragt direkt „Wer darf was?“: Unter jeder Klasse stehen vier Rechte (abstimmen, klagen, in den Rat, Archont werden) zum Ankreuzen, dazu zeichnen die Schüler Pfeile von den Klassen zu den Ämtern. Abschreiben hilft nicht, weil das Buch-Schaubild anders aufgebaut ist. Eingesammelt zeigt das Blatt auf einen Blick, wer die Abstufung der Rechte verstanden hat.</w:t>
+        <w:t xml:space="preserve"> Es fragt direkt „Wer darf was?“: Unter jeder Klasse stehen vier Rechte (abstimmen, klagen, in den Rat, Archont werden) zum Ankreuzen, dazu zeichnen die Schüler Pfeile von den Klassen zu den Ämtern. Das projizierte Buch-Schaubild (Folie 6) ist dann längst weggeschaltet; abschreiben ginge ohnehin nicht, weil es anders aufgebaut ist. Eingesammelt zeigt das Blatt auf einen Blick, wer die Abstufung der Rechte verstanden hat.</w:t>
       </w:r>
     </w:p>
     <w:p>

</xml_diff>